<commit_message>
feat: implement portfolio layout and section components with responsive navigation
</commit_message>
<xml_diff>
--- a/info.docx
+++ b/info.docx
@@ -110,7 +110,7 @@
     <w:p>
       <w:r>
         <w:pict w14:anchorId="76DBCC44">
-          <v:rect id="_x0000_i1073" style="width:0;height:1.5pt" o:hralign="center" o:hrstd="t" o:hr="t" fillcolor="#a0a0a0" stroked="f"/>
+          <v:rect id="_x0000_i1123" style="width:0;height:1.5pt" o:hralign="center" o:hrstd="t" o:hr="t" fillcolor="#a0a0a0" stroked="f"/>
         </w:pict>
       </w:r>
     </w:p>
@@ -246,7 +246,7 @@
     <w:p>
       <w:r>
         <w:pict w14:anchorId="69383CB8">
-          <v:rect id="_x0000_i1074" style="width:0;height:1.5pt" o:hralign="center" o:hrstd="t" o:hr="t" fillcolor="#a0a0a0" stroked="f"/>
+          <v:rect id="_x0000_i1124" style="width:0;height:1.5pt" o:hralign="center" o:hrstd="t" o:hr="t" fillcolor="#a0a0a0" stroked="f"/>
         </w:pict>
       </w:r>
     </w:p>
@@ -313,7 +313,7 @@
     <w:p>
       <w:r>
         <w:pict w14:anchorId="2D7E4DF7">
-          <v:rect id="_x0000_i1075" style="width:0;height:1.5pt" o:hralign="center" o:hrstd="t" o:hr="t" fillcolor="#a0a0a0" stroked="f"/>
+          <v:rect id="_x0000_i1125" style="width:0;height:1.5pt" o:hralign="center" o:hrstd="t" o:hr="t" fillcolor="#a0a0a0" stroked="f"/>
         </w:pict>
       </w:r>
     </w:p>
@@ -407,7 +407,7 @@
     <w:p>
       <w:r>
         <w:pict w14:anchorId="6181BE84">
-          <v:rect id="_x0000_i1076" style="width:0;height:1.5pt" o:hralign="center" o:hrstd="t" o:hr="t" fillcolor="#a0a0a0" stroked="f"/>
+          <v:rect id="_x0000_i1126" style="width:0;height:1.5pt" o:hralign="center" o:hrstd="t" o:hr="t" fillcolor="#a0a0a0" stroked="f"/>
         </w:pict>
       </w:r>
     </w:p>
@@ -619,7 +619,7 @@
     <w:p>
       <w:r>
         <w:pict w14:anchorId="4976BA39">
-          <v:rect id="_x0000_i1077" style="width:0;height:1.5pt" o:hralign="center" o:hrstd="t" o:hr="t" fillcolor="#a0a0a0" stroked="f"/>
+          <v:rect id="_x0000_i1127" style="width:0;height:1.5pt" o:hralign="center" o:hrstd="t" o:hr="t" fillcolor="#a0a0a0" stroked="f"/>
         </w:pict>
       </w:r>
     </w:p>
@@ -728,6 +728,11 @@
       </w:r>
     </w:p>
     <w:p/>
+    <w:p>
+      <w:r>
+        <w:t>https://github.com/nextlevelbuilder/ui-ux-pro-max-skill</w:t>
+      </w:r>
+    </w:p>
     <w:sectPr>
       <w:pgSz w:w="12240" w:h="15840"/>
       <w:pgMar w:top="1440" w:right="1440" w:bottom="1440" w:left="1440" w:header="720" w:footer="720" w:gutter="0"/>

</xml_diff>